<commit_message>
Improve nearest word display and update report outputs
</commit_message>
<xml_diff>
--- a/reports/NLP_Mini_Project_3_Khmer_Word_Embeddings_Report.docx
+++ b/reports/NLP_Mini_Project_3_Khmer_Word_Embeddings_Report.docx
@@ -60,7 +60,7 @@
         <w:jc w:val="center"/>
       </w:pPr>
       <w:r>
-        <w:t>Date: 2026-06-15</w:t>
+        <w:t>Date: 2026-06-16</w:t>
       </w:r>
     </w:p>
     <w:p>
@@ -1363,6 +1363,924 @@
         <w:t>Cosine similarity compares word vectors. Nearest words are interpreted as contextual neighbors, not always perfect synonyms, because the corpus is small and domain-specific.</w:t>
       </w:r>
     </w:p>
+    <w:p>
+      <w:r>
+        <w:rPr>
+          <w:b/>
+          <w:sz w:val="21"/>
+        </w:rPr>
+        <w:t>For readability, &lt;UNK&gt; and common function words are hidden from this table. This does not change the trained embeddings.</w:t>
+      </w:r>
+    </w:p>
+    <w:tbl>
+      <w:tblPr>
+        <w:tblStyle w:val="TableGrid"/>
+        <w:tblW w:type="auto" w:w="0"/>
+        <w:jc w:val="center"/>
+        <w:tblLook w:firstColumn="1" w:firstRow="1" w:lastColumn="0" w:lastRow="0" w:noHBand="0" w:noVBand="1" w:val="04A0"/>
+      </w:tblPr>
+      <w:tblGrid>
+        <w:gridCol w:w="2484"/>
+        <w:gridCol w:w="2484"/>
+        <w:gridCol w:w="2484"/>
+        <w:gridCol w:w="2484"/>
+      </w:tblGrid>
+      <w:tr>
+        <w:tc>
+          <w:tcPr>
+            <w:tcW w:type="dxa" w:w="2484"/>
+          </w:tcPr>
+          <w:p>
+            <w:r>
+              <w:rPr>
+                <w:b/>
+              </w:rPr>
+              <w:t>Query Word</w:t>
+            </w:r>
+          </w:p>
+        </w:tc>
+        <w:tc>
+          <w:tcPr>
+            <w:tcW w:type="dxa" w:w="2484"/>
+          </w:tcPr>
+          <w:p>
+            <w:r>
+              <w:rPr>
+                <w:b/>
+              </w:rPr>
+              <w:t>Similar Word</w:t>
+            </w:r>
+          </w:p>
+        </w:tc>
+        <w:tc>
+          <w:tcPr>
+            <w:tcW w:type="dxa" w:w="2484"/>
+          </w:tcPr>
+          <w:p>
+            <w:r>
+              <w:rPr>
+                <w:b/>
+              </w:rPr>
+              <w:t>Frequency</w:t>
+            </w:r>
+          </w:p>
+        </w:tc>
+        <w:tc>
+          <w:tcPr>
+            <w:tcW w:type="dxa" w:w="2484"/>
+          </w:tcPr>
+          <w:p>
+            <w:r>
+              <w:rPr>
+                <w:b/>
+              </w:rPr>
+              <w:t>Cosine Similarity</w:t>
+            </w:r>
+          </w:p>
+        </w:tc>
+      </w:tr>
+      <w:tr>
+        <w:tc>
+          <w:tcPr>
+            <w:tcW w:type="dxa" w:w="2484"/>
+          </w:tcPr>
+          <w:p>
+            <w:r>
+              <w:t>ប្រាសាទ</w:t>
+            </w:r>
+          </w:p>
+        </w:tc>
+        <w:tc>
+          <w:tcPr>
+            <w:tcW w:type="dxa" w:w="2484"/>
+          </w:tcPr>
+          <w:p>
+            <w:r>
+              <w:t>សតវត្ស</w:t>
+            </w:r>
+          </w:p>
+        </w:tc>
+        <w:tc>
+          <w:tcPr>
+            <w:tcW w:type="dxa" w:w="2484"/>
+          </w:tcPr>
+          <w:p>
+            <w:r>
+              <w:t>17</w:t>
+            </w:r>
+          </w:p>
+        </w:tc>
+        <w:tc>
+          <w:tcPr>
+            <w:tcW w:type="dxa" w:w="2484"/>
+          </w:tcPr>
+          <w:p>
+            <w:r>
+              <w:t>0.5914</w:t>
+            </w:r>
+          </w:p>
+        </w:tc>
+      </w:tr>
+      <w:tr>
+        <w:tc>
+          <w:tcPr>
+            <w:tcW w:type="dxa" w:w="2484"/>
+          </w:tcPr>
+          <w:p>
+            <w:r>
+              <w:t>ប្រាសាទ</w:t>
+            </w:r>
+          </w:p>
+        </w:tc>
+        <w:tc>
+          <w:tcPr>
+            <w:tcW w:type="dxa" w:w="2484"/>
+          </w:tcPr>
+          <w:p>
+            <w:r>
+              <w:t>ប្រទេស</w:t>
+            </w:r>
+          </w:p>
+        </w:tc>
+        <w:tc>
+          <w:tcPr>
+            <w:tcW w:type="dxa" w:w="2484"/>
+          </w:tcPr>
+          <w:p>
+            <w:r>
+              <w:t>17</w:t>
+            </w:r>
+          </w:p>
+        </w:tc>
+        <w:tc>
+          <w:tcPr>
+            <w:tcW w:type="dxa" w:w="2484"/>
+          </w:tcPr>
+          <w:p>
+            <w:r>
+              <w:t>0.5365</w:t>
+            </w:r>
+          </w:p>
+        </w:tc>
+      </w:tr>
+      <w:tr>
+        <w:tc>
+          <w:tcPr>
+            <w:tcW w:type="dxa" w:w="2484"/>
+          </w:tcPr>
+          <w:p>
+            <w:r>
+              <w:t>ប្រាសាទ</w:t>
+            </w:r>
+          </w:p>
+        </w:tc>
+        <w:tc>
+          <w:tcPr>
+            <w:tcW w:type="dxa" w:w="2484"/>
+          </w:tcPr>
+          <w:p>
+            <w:r>
+              <w:t>តំណាង</w:t>
+            </w:r>
+          </w:p>
+        </w:tc>
+        <w:tc>
+          <w:tcPr>
+            <w:tcW w:type="dxa" w:w="2484"/>
+          </w:tcPr>
+          <w:p>
+            <w:r>
+              <w:t>13</w:t>
+            </w:r>
+          </w:p>
+        </w:tc>
+        <w:tc>
+          <w:tcPr>
+            <w:tcW w:type="dxa" w:w="2484"/>
+          </w:tcPr>
+          <w:p>
+            <w:r>
+              <w:t>0.5147</w:t>
+            </w:r>
+          </w:p>
+        </w:tc>
+      </w:tr>
+      <w:tr>
+        <w:tc>
+          <w:tcPr>
+            <w:tcW w:type="dxa" w:w="2484"/>
+          </w:tcPr>
+          <w:p>
+            <w:r>
+              <w:t>ប្រាសាទ</w:t>
+            </w:r>
+          </w:p>
+        </w:tc>
+        <w:tc>
+          <w:tcPr>
+            <w:tcW w:type="dxa" w:w="2484"/>
+          </w:tcPr>
+          <w:p>
+            <w:r>
+              <w:t>ផ្នែក</w:t>
+            </w:r>
+          </w:p>
+        </w:tc>
+        <w:tc>
+          <w:tcPr>
+            <w:tcW w:type="dxa" w:w="2484"/>
+          </w:tcPr>
+          <w:p>
+            <w:r>
+              <w:t>18</w:t>
+            </w:r>
+          </w:p>
+        </w:tc>
+        <w:tc>
+          <w:tcPr>
+            <w:tcW w:type="dxa" w:w="2484"/>
+          </w:tcPr>
+          <w:p>
+            <w:r>
+              <w:t>0.4326</w:t>
+            </w:r>
+          </w:p>
+        </w:tc>
+      </w:tr>
+      <w:tr>
+        <w:tc>
+          <w:tcPr>
+            <w:tcW w:type="dxa" w:w="2484"/>
+          </w:tcPr>
+          <w:p>
+            <w:r>
+              <w:t>ប្រាសាទ</w:t>
+            </w:r>
+          </w:p>
+        </w:tc>
+        <w:tc>
+          <w:tcPr>
+            <w:tcW w:type="dxa" w:w="2484"/>
+          </w:tcPr>
+          <w:p>
+            <w:r>
+              <w:t>ខាងត្បូង</w:t>
+            </w:r>
+          </w:p>
+        </w:tc>
+        <w:tc>
+          <w:tcPr>
+            <w:tcW w:type="dxa" w:w="2484"/>
+          </w:tcPr>
+          <w:p>
+            <w:r>
+              <w:t>12</w:t>
+            </w:r>
+          </w:p>
+        </w:tc>
+        <w:tc>
+          <w:tcPr>
+            <w:tcW w:type="dxa" w:w="2484"/>
+          </w:tcPr>
+          <w:p>
+            <w:r>
+              <w:t>0.4271</w:t>
+            </w:r>
+          </w:p>
+        </w:tc>
+      </w:tr>
+      <w:tr>
+        <w:tc>
+          <w:tcPr>
+            <w:tcW w:type="dxa" w:w="2484"/>
+          </w:tcPr>
+          <w:p>
+            <w:r>
+              <w:t>ប្រាសាទ</w:t>
+            </w:r>
+          </w:p>
+        </w:tc>
+        <w:tc>
+          <w:tcPr>
+            <w:tcW w:type="dxa" w:w="2484"/>
+          </w:tcPr>
+          <w:p>
+            <w:r>
+              <w:t>ខាងកើត</w:t>
+            </w:r>
+          </w:p>
+        </w:tc>
+        <w:tc>
+          <w:tcPr>
+            <w:tcW w:type="dxa" w:w="2484"/>
+          </w:tcPr>
+          <w:p>
+            <w:r>
+              <w:t>16</w:t>
+            </w:r>
+          </w:p>
+        </w:tc>
+        <w:tc>
+          <w:tcPr>
+            <w:tcW w:type="dxa" w:w="2484"/>
+          </w:tcPr>
+          <w:p>
+            <w:r>
+              <w:t>0.4234</w:t>
+            </w:r>
+          </w:p>
+        </w:tc>
+      </w:tr>
+      <w:tr>
+        <w:tc>
+          <w:tcPr>
+            <w:tcW w:type="dxa" w:w="2484"/>
+          </w:tcPr>
+          <w:p>
+            <w:r>
+              <w:t>ប្រាសាទ</w:t>
+            </w:r>
+          </w:p>
+        </w:tc>
+        <w:tc>
+          <w:tcPr>
+            <w:tcW w:type="dxa" w:w="2484"/>
+          </w:tcPr>
+          <w:p>
+            <w:r>
+              <w:t>អង្គរ</w:t>
+            </w:r>
+          </w:p>
+        </w:tc>
+        <w:tc>
+          <w:tcPr>
+            <w:tcW w:type="dxa" w:w="2484"/>
+          </w:tcPr>
+          <w:p>
+            <w:r>
+              <w:t>58</w:t>
+            </w:r>
+          </w:p>
+        </w:tc>
+        <w:tc>
+          <w:tcPr>
+            <w:tcW w:type="dxa" w:w="2484"/>
+          </w:tcPr>
+          <w:p>
+            <w:r>
+              <w:t>0.4173</w:t>
+            </w:r>
+          </w:p>
+        </w:tc>
+      </w:tr>
+      <w:tr>
+        <w:tc>
+          <w:tcPr>
+            <w:tcW w:type="dxa" w:w="2484"/>
+          </w:tcPr>
+          <w:p>
+            <w:r>
+              <w:t>ប្រាសាទ</w:t>
+            </w:r>
+          </w:p>
+        </w:tc>
+        <w:tc>
+          <w:tcPr>
+            <w:tcW w:type="dxa" w:w="2484"/>
+          </w:tcPr>
+          <w:p>
+            <w:r>
+              <w:t>ស្ថិត</w:t>
+            </w:r>
+          </w:p>
+        </w:tc>
+        <w:tc>
+          <w:tcPr>
+            <w:tcW w:type="dxa" w:w="2484"/>
+          </w:tcPr>
+          <w:p>
+            <w:r>
+              <w:t>24</w:t>
+            </w:r>
+          </w:p>
+        </w:tc>
+        <w:tc>
+          <w:tcPr>
+            <w:tcW w:type="dxa" w:w="2484"/>
+          </w:tcPr>
+          <w:p>
+            <w:r>
+              <w:t>0.4151</w:t>
+            </w:r>
+          </w:p>
+        </w:tc>
+      </w:tr>
+      <w:tr>
+        <w:tc>
+          <w:tcPr>
+            <w:tcW w:type="dxa" w:w="2484"/>
+          </w:tcPr>
+          <w:p>
+            <w:r>
+              <w:t>ប្រាសាទ</w:t>
+            </w:r>
+          </w:p>
+        </w:tc>
+        <w:tc>
+          <w:tcPr>
+            <w:tcW w:type="dxa" w:w="2484"/>
+          </w:tcPr>
+          <w:p>
+            <w:r>
+              <w:t>ខាងក្នុង</w:t>
+            </w:r>
+          </w:p>
+        </w:tc>
+        <w:tc>
+          <w:tcPr>
+            <w:tcW w:type="dxa" w:w="2484"/>
+          </w:tcPr>
+          <w:p>
+            <w:r>
+              <w:t>13</w:t>
+            </w:r>
+          </w:p>
+        </w:tc>
+        <w:tc>
+          <w:tcPr>
+            <w:tcW w:type="dxa" w:w="2484"/>
+          </w:tcPr>
+          <w:p>
+            <w:r>
+              <w:t>0.3858</w:t>
+            </w:r>
+          </w:p>
+        </w:tc>
+      </w:tr>
+      <w:tr>
+        <w:tc>
+          <w:tcPr>
+            <w:tcW w:type="dxa" w:w="2484"/>
+          </w:tcPr>
+          <w:p>
+            <w:r>
+              <w:t>ប្រាសាទ</w:t>
+            </w:r>
+          </w:p>
+        </w:tc>
+        <w:tc>
+          <w:tcPr>
+            <w:tcW w:type="dxa" w:w="2484"/>
+          </w:tcPr>
+          <w:p>
+            <w:r>
+              <w:t>រួម</w:t>
+            </w:r>
+          </w:p>
+        </w:tc>
+        <w:tc>
+          <w:tcPr>
+            <w:tcW w:type="dxa" w:w="2484"/>
+          </w:tcPr>
+          <w:p>
+            <w:r>
+              <w:t>19</w:t>
+            </w:r>
+          </w:p>
+        </w:tc>
+        <w:tc>
+          <w:tcPr>
+            <w:tcW w:type="dxa" w:w="2484"/>
+          </w:tcPr>
+          <w:p>
+            <w:r>
+              <w:t>0.3823</w:t>
+            </w:r>
+          </w:p>
+        </w:tc>
+      </w:tr>
+      <w:tr>
+        <w:tc>
+          <w:tcPr>
+            <w:tcW w:type="dxa" w:w="2484"/>
+          </w:tcPr>
+          <w:p>
+            <w:r>
+              <w:t>ថា</w:t>
+            </w:r>
+          </w:p>
+        </w:tc>
+        <w:tc>
+          <w:tcPr>
+            <w:tcW w:type="dxa" w:w="2484"/>
+          </w:tcPr>
+          <w:p>
+            <w:r>
+              <w:t>ឈ្មោះ</w:t>
+            </w:r>
+          </w:p>
+        </w:tc>
+        <w:tc>
+          <w:tcPr>
+            <w:tcW w:type="dxa" w:w="2484"/>
+          </w:tcPr>
+          <w:p>
+            <w:r>
+              <w:t>37</w:t>
+            </w:r>
+          </w:p>
+        </w:tc>
+        <w:tc>
+          <w:tcPr>
+            <w:tcW w:type="dxa" w:w="2484"/>
+          </w:tcPr>
+          <w:p>
+            <w:r>
+              <w:t>0.6439</w:t>
+            </w:r>
+          </w:p>
+        </w:tc>
+      </w:tr>
+      <w:tr>
+        <w:tc>
+          <w:tcPr>
+            <w:tcW w:type="dxa" w:w="2484"/>
+          </w:tcPr>
+          <w:p>
+            <w:r>
+              <w:t>ថា</w:t>
+            </w:r>
+          </w:p>
+        </w:tc>
+        <w:tc>
+          <w:tcPr>
+            <w:tcW w:type="dxa" w:w="2484"/>
+          </w:tcPr>
+          <w:p>
+            <w:r>
+              <w:t>វា</w:t>
+            </w:r>
+          </w:p>
+        </w:tc>
+        <w:tc>
+          <w:tcPr>
+            <w:tcW w:type="dxa" w:w="2484"/>
+          </w:tcPr>
+          <w:p>
+            <w:r>
+              <w:t>22</w:t>
+            </w:r>
+          </w:p>
+        </w:tc>
+        <w:tc>
+          <w:tcPr>
+            <w:tcW w:type="dxa" w:w="2484"/>
+          </w:tcPr>
+          <w:p>
+            <w:r>
+              <w:t>0.5138</w:t>
+            </w:r>
+          </w:p>
+        </w:tc>
+      </w:tr>
+      <w:tr>
+        <w:tc>
+          <w:tcPr>
+            <w:tcW w:type="dxa" w:w="2484"/>
+          </w:tcPr>
+          <w:p>
+            <w:r>
+              <w:t>ថា</w:t>
+            </w:r>
+          </w:p>
+        </w:tc>
+        <w:tc>
+          <w:tcPr>
+            <w:tcW w:type="dxa" w:w="2484"/>
+          </w:tcPr>
+          <w:p>
+            <w:r>
+              <w:t>ឆ្នាំ</w:t>
+            </w:r>
+          </w:p>
+        </w:tc>
+        <w:tc>
+          <w:tcPr>
+            <w:tcW w:type="dxa" w:w="2484"/>
+          </w:tcPr>
+          <w:p>
+            <w:r>
+              <w:t>39</w:t>
+            </w:r>
+          </w:p>
+        </w:tc>
+        <w:tc>
+          <w:tcPr>
+            <w:tcW w:type="dxa" w:w="2484"/>
+          </w:tcPr>
+          <w:p>
+            <w:r>
+              <w:t>0.4688</w:t>
+            </w:r>
+          </w:p>
+        </w:tc>
+      </w:tr>
+      <w:tr>
+        <w:tc>
+          <w:tcPr>
+            <w:tcW w:type="dxa" w:w="2484"/>
+          </w:tcPr>
+          <w:p>
+            <w:r>
+              <w:t>ថា</w:t>
+            </w:r>
+          </w:p>
+        </w:tc>
+        <w:tc>
+          <w:tcPr>
+            <w:tcW w:type="dxa" w:w="2484"/>
+          </w:tcPr>
+          <w:p>
+            <w:r>
+              <w:t>កណ្ដាល</w:t>
+            </w:r>
+          </w:p>
+        </w:tc>
+        <w:tc>
+          <w:tcPr>
+            <w:tcW w:type="dxa" w:w="2484"/>
+          </w:tcPr>
+          <w:p>
+            <w:r>
+              <w:t>15</w:t>
+            </w:r>
+          </w:p>
+        </w:tc>
+        <w:tc>
+          <w:tcPr>
+            <w:tcW w:type="dxa" w:w="2484"/>
+          </w:tcPr>
+          <w:p>
+            <w:r>
+              <w:t>0.462</w:t>
+            </w:r>
+          </w:p>
+        </w:tc>
+      </w:tr>
+      <w:tr>
+        <w:tc>
+          <w:tcPr>
+            <w:tcW w:type="dxa" w:w="2484"/>
+          </w:tcPr>
+          <w:p>
+            <w:r>
+              <w:t>ថា</w:t>
+            </w:r>
+          </w:p>
+        </w:tc>
+        <w:tc>
+          <w:tcPr>
+            <w:tcW w:type="dxa" w:w="2484"/>
+          </w:tcPr>
+          <w:p>
+            <w:r>
+              <w:t>រចនាបថ</w:t>
+            </w:r>
+          </w:p>
+        </w:tc>
+        <w:tc>
+          <w:tcPr>
+            <w:tcW w:type="dxa" w:w="2484"/>
+          </w:tcPr>
+          <w:p>
+            <w:r>
+              <w:t>12</w:t>
+            </w:r>
+          </w:p>
+        </w:tc>
+        <w:tc>
+          <w:tcPr>
+            <w:tcW w:type="dxa" w:w="2484"/>
+          </w:tcPr>
+          <w:p>
+            <w:r>
+              <w:t>0.4493</w:t>
+            </w:r>
+          </w:p>
+        </w:tc>
+      </w:tr>
+      <w:tr>
+        <w:tc>
+          <w:tcPr>
+            <w:tcW w:type="dxa" w:w="2484"/>
+          </w:tcPr>
+          <w:p>
+            <w:r>
+              <w:t>ថា</w:t>
+            </w:r>
+          </w:p>
+        </w:tc>
+        <w:tc>
+          <w:tcPr>
+            <w:tcW w:type="dxa" w:w="2484"/>
+          </w:tcPr>
+          <w:p>
+            <w:r>
+              <w:t>ខាង</w:t>
+            </w:r>
+          </w:p>
+        </w:tc>
+        <w:tc>
+          <w:tcPr>
+            <w:tcW w:type="dxa" w:w="2484"/>
+          </w:tcPr>
+          <w:p>
+            <w:r>
+              <w:t>21</w:t>
+            </w:r>
+          </w:p>
+        </w:tc>
+        <w:tc>
+          <w:tcPr>
+            <w:tcW w:type="dxa" w:w="2484"/>
+          </w:tcPr>
+          <w:p>
+            <w:r>
+              <w:t>0.4036</w:t>
+            </w:r>
+          </w:p>
+        </w:tc>
+      </w:tr>
+      <w:tr>
+        <w:tc>
+          <w:tcPr>
+            <w:tcW w:type="dxa" w:w="2484"/>
+          </w:tcPr>
+          <w:p>
+            <w:r>
+              <w:t>ថា</w:t>
+            </w:r>
+          </w:p>
+        </w:tc>
+        <w:tc>
+          <w:tcPr>
+            <w:tcW w:type="dxa" w:w="2484"/>
+          </w:tcPr>
+          <w:p>
+            <w:r>
+              <w:t>លើ</w:t>
+            </w:r>
+          </w:p>
+        </w:tc>
+        <w:tc>
+          <w:tcPr>
+            <w:tcW w:type="dxa" w:w="2484"/>
+          </w:tcPr>
+          <w:p>
+            <w:r>
+              <w:t>51</w:t>
+            </w:r>
+          </w:p>
+        </w:tc>
+        <w:tc>
+          <w:tcPr>
+            <w:tcW w:type="dxa" w:w="2484"/>
+          </w:tcPr>
+          <w:p>
+            <w:r>
+              <w:t>0.3958</w:t>
+            </w:r>
+          </w:p>
+        </w:tc>
+      </w:tr>
+      <w:tr>
+        <w:tc>
+          <w:tcPr>
+            <w:tcW w:type="dxa" w:w="2484"/>
+          </w:tcPr>
+          <w:p>
+            <w:r>
+              <w:t>ថា</w:t>
+            </w:r>
+          </w:p>
+        </w:tc>
+        <w:tc>
+          <w:tcPr>
+            <w:tcW w:type="dxa" w:w="2484"/>
+          </w:tcPr>
+          <w:p>
+            <w:r>
+              <w:t>ចេញ</w:t>
+            </w:r>
+          </w:p>
+        </w:tc>
+        <w:tc>
+          <w:tcPr>
+            <w:tcW w:type="dxa" w:w="2484"/>
+          </w:tcPr>
+          <w:p>
+            <w:r>
+              <w:t>15</w:t>
+            </w:r>
+          </w:p>
+        </w:tc>
+        <w:tc>
+          <w:tcPr>
+            <w:tcW w:type="dxa" w:w="2484"/>
+          </w:tcPr>
+          <w:p>
+            <w:r>
+              <w:t>0.378</w:t>
+            </w:r>
+          </w:p>
+        </w:tc>
+      </w:tr>
+      <w:tr>
+        <w:tc>
+          <w:tcPr>
+            <w:tcW w:type="dxa" w:w="2484"/>
+          </w:tcPr>
+          <w:p>
+            <w:r>
+              <w:t>ថា</w:t>
+            </w:r>
+          </w:p>
+        </w:tc>
+        <w:tc>
+          <w:tcPr>
+            <w:tcW w:type="dxa" w:w="2484"/>
+          </w:tcPr>
+          <w:p>
+            <w:r>
+              <w:t>ដូចជា</w:t>
+            </w:r>
+          </w:p>
+        </w:tc>
+        <w:tc>
+          <w:tcPr>
+            <w:tcW w:type="dxa" w:w="2484"/>
+          </w:tcPr>
+          <w:p>
+            <w:r>
+              <w:t>21</w:t>
+            </w:r>
+          </w:p>
+        </w:tc>
+        <w:tc>
+          <w:tcPr>
+            <w:tcW w:type="dxa" w:w="2484"/>
+          </w:tcPr>
+          <w:p>
+            <w:r>
+              <w:t>0.362</w:t>
+            </w:r>
+          </w:p>
+        </w:tc>
+      </w:tr>
+      <w:tr>
+        <w:tc>
+          <w:tcPr>
+            <w:tcW w:type="dxa" w:w="2484"/>
+          </w:tcPr>
+          <w:p>
+            <w:r>
+              <w:t>ថា</w:t>
+            </w:r>
+          </w:p>
+        </w:tc>
+        <w:tc>
+          <w:tcPr>
+            <w:tcW w:type="dxa" w:w="2484"/>
+          </w:tcPr>
+          <w:p>
+            <w:r>
+              <w:t>បី</w:t>
+            </w:r>
+          </w:p>
+        </w:tc>
+        <w:tc>
+          <w:tcPr>
+            <w:tcW w:type="dxa" w:w="2484"/>
+          </w:tcPr>
+          <w:p>
+            <w:r>
+              <w:t>16</w:t>
+            </w:r>
+          </w:p>
+        </w:tc>
+        <w:tc>
+          <w:tcPr>
+            <w:tcW w:type="dxa" w:w="2484"/>
+          </w:tcPr>
+          <w:p>
+            <w:r>
+              <w:t>0.347</w:t>
+            </w:r>
+          </w:p>
+        </w:tc>
+      </w:tr>
+    </w:tbl>
+    <w:p/>
     <w:p>
       <w:pPr>
         <w:pStyle w:val="Heading1"/>

</xml_diff>